<commit_message>
Make repository narrative audience-facing
</commit_message>
<xml_diff>
--- a/KisanFlow_NABARD_Application.docx
+++ b/KisanFlow_NABARD_Application.docx
@@ -524,7 +524,7 @@
         <w:spacing w:before="240" w:after="120"/>
       </w:pPr>
       <w:r>
-        <w:t xml:space="preserve">Why this submission can win</w:t>
+        <w:t xml:space="preserve">Why KisanFlow is differentiated</w:t>
       </w:r>
     </w:p>
     <w:p>
@@ -652,7 +652,7 @@
         </w:rPr>
         <w:t xml:space="preserve">Source: </w:t>
       </w:r>
-      <w:hyperlink w:history="1" r:id="rIdg7jqyys-voetnfrhtbn-2">
+      <w:hyperlink w:history="1" r:id="rIdbxzhdzsjrz2uuc8tooipe">
         <w:r>
           <w:rPr>
             <w:rStyle w:val="Hyperlink"/>
@@ -2045,7 +2045,7 @@
         </w:rPr>
         <w:t xml:space="preserve">Source: </w:t>
       </w:r>
-      <w:hyperlink w:history="1" r:id="rIdbhq0bn1oevlmx1rvlmsze">
+      <w:hyperlink w:history="1" r:id="rIdqdy8ztkkp8kdmbwj89on-">
         <w:r>
           <w:rPr>
             <w:rStyle w:val="Hyperlink"/>
@@ -2072,7 +2072,7 @@
         </w:rPr>
         <w:t xml:space="preserve">Source: </w:t>
       </w:r>
-      <w:hyperlink w:history="1" r:id="rId4zgfa3nxmmjyolzefs1tq">
+      <w:hyperlink w:history="1" r:id="rIdwwf3s7sstaneditzvtxyr">
         <w:r>
           <w:rPr>
             <w:rStyle w:val="Hyperlink"/>
@@ -4747,7 +4747,7 @@
         </w:rPr>
         <w:t xml:space="preserve">Source: </w:t>
       </w:r>
-      <w:hyperlink w:history="1" r:id="rIdryyogb-nura1ose2ot5yd">
+      <w:hyperlink w:history="1" r:id="rIdx7bdycfix4khhfyq5zvx3">
         <w:r>
           <w:rPr>
             <w:rStyle w:val="Hyperlink"/>
@@ -4774,7 +4774,7 @@
         </w:rPr>
         <w:t xml:space="preserve">Source: </w:t>
       </w:r>
-      <w:hyperlink w:history="1" r:id="rIdsx5fdvo_s7vxzhineyayf">
+      <w:hyperlink w:history="1" r:id="rIdk7cbqbjwqxovnoxbjqze4">
         <w:r>
           <w:rPr>
             <w:rStyle w:val="Hyperlink"/>
@@ -6105,7 +6105,7 @@
         <w:spacing w:before="240" w:after="120"/>
       </w:pPr>
       <w:r>
-        <w:t xml:space="preserve">Proven in the submission package</w:t>
+        <w:t xml:space="preserve">Demonstrated in the working prototype</w:t>
       </w:r>
     </w:p>
     <w:p>
@@ -6952,7 +6952,7 @@
         </w:rPr>
         <w:t xml:space="preserve">Live demo: </w:t>
       </w:r>
-      <w:hyperlink w:history="1" r:id="rIdqfutcrpu4k65lwlcvxzal">
+      <w:hyperlink w:history="1" r:id="rIdwzruggaewr6bx4s08xdj8">
         <w:r>
           <w:rPr>
             <w:rStyle w:val="Hyperlink"/>

</xml_diff>